<commit_message>
refine: tighten beyond ridge feature layout
</commit_message>
<xml_diff>
--- a/manuscripts/09_feature_越岭_几华里.docx
+++ b/manuscripts/09_feature_越岭_几华里.docx
@@ -84,42 +84,10 @@
     </w:p>
     <w:p>
       <w:pPr>
-        <w:pStyle w:val="FeatureMedia"/>
-      </w:pPr>
-      <w:r>
-        <w:t>[[YUELING_MEDIA_02]]</w:t>
-      </w:r>
-    </w:p>
-    <w:p>
-      <w:pPr>
-        <w:pStyle w:val="Caption"/>
-      </w:pPr>
-      <w:r>
-        <w:t>2007年11月26日发布的《大约在冬季——山东大学科幻沙龙报道之我眼中的科幻世界》节选。</w:t>
-      </w:r>
-    </w:p>
-    <w:p>
-      <w:pPr>
         <w:pStyle w:val="Body"/>
       </w:pPr>
       <w:r>
         <w:t>12月9日，应山东师范大学科幻协会邀请，肖兆旭和山大幻协部分成员前往山师交流。下午3时左右，山师幻协会长马云青接待了山大一行。肖兆旭介绍了山东大学科幻协会的历史、人员组成和代表性活动，会员艾崴随后主讲《中国科幻发展史》。讲座结束后，两校会员和理事会成员进行了交流。这两次活动形成了一来一往的交流。11月25日是山师成员到山大，12月9日则是山大成员到山师。</w:t>
-      </w:r>
-    </w:p>
-    <w:p>
-      <w:pPr>
-        <w:pStyle w:val="FeatureMedia"/>
-      </w:pPr>
-      <w:r>
-        <w:t>[[YUELING_MEDIA_03]]</w:t>
-      </w:r>
-    </w:p>
-    <w:p>
-      <w:pPr>
-        <w:pStyle w:val="Caption"/>
-      </w:pPr>
-      <w:r>
-        <w:t>2007年12月山大幻协赴山东师范大学交流的同期报道节选。</w:t>
       </w:r>
     </w:p>
     <w:p>
@@ -224,22 +192,6 @@
       </w:pPr>
       <w:r>
         <w:t>月曜杯筹备期间，2024年3月16日，山东大学方面联系了山东财经大学星域科幻协会、山东建筑大学四维科幻协会、泰山科技学院泰山科幻社以及哈尔滨工业大学（威海）的科幻爱好者或负责人，建立了“齐鲁科幻联盟”QQ群。</w:t>
-      </w:r>
-    </w:p>
-    <w:p>
-      <w:pPr>
-        <w:pStyle w:val="FeatureMedia"/>
-      </w:pPr>
-      <w:r>
-        <w:t>[[YUELING_MEDIA_04]]</w:t>
-      </w:r>
-    </w:p>
-    <w:p>
-      <w:pPr>
-        <w:pStyle w:val="Caption"/>
-      </w:pPr>
-      <w:r>
-        <w:t>鲲图《第一届“月曜杯”山东高校科幻联合征文幕后二三事》中关于2024年3月16日“齐鲁科幻联盟”建群的记录。</w:t>
       </w:r>
     </w:p>
     <w:p>

</xml_diff>

<commit_message>
refine: use continuous two-column feature layout
</commit_message>
<xml_diff>
--- a/manuscripts/09_feature_越岭_几华里.docx
+++ b/manuscripts/09_feature_越岭_几华里.docx
@@ -20,7 +20,7 @@
     </w:p>
     <w:p>
       <w:pPr>
-        <w:pStyle w:val="FeatureLead"/>
+        <w:pStyle w:val="Body"/>
       </w:pPr>
       <w:r>
         <w:t>山东大学学生科幻协会成立以后，很早就开始尝试同其他高校的科幻社团建立联系。现存材料中，2007年的“驻济高校科幻联盟”筹备、2020年的“山与海”跨校联文以及2024年的月曜杯，构成了几段较为清晰的记录。它们彼此之间没有可以确认的组织继承关系，但都与同一个问题有关：山东省不同高校里的科幻爱好者，怎样彼此找到对方。</w:t>
@@ -12338,7 +12338,7 @@
     <w:rPr>
       <w:rFonts w:ascii="Source Han Sans SC" w:hAnsi="Source Han Sans SC" w:eastAsia="思源黑体"/>
       <w:b w:val="0"/>
-      <w:sz w:val="21"/>
+      <w:sz w:val="18"/>
     </w:rPr>
   </w:style>
   <w:style w:type="paragraph" w:customStyle="1" w:styleId="FeatureLead">
@@ -12354,9 +12354,9 @@
     <w:name w:val="FeatureSection"/>
     <w:basedOn w:val="Normal"/>
     <w:rPr>
-      <w:rFonts w:ascii="Source Han Serif SC" w:hAnsi="Source Han Serif SC" w:eastAsia="思源宋体"/>
+      <w:rFonts w:ascii="Source Han Sans SC" w:hAnsi="Source Han Sans SC" w:eastAsia="思源黑体"/>
       <w:b/>
-      <w:sz w:val="28"/>
+      <w:sz w:val="23"/>
     </w:rPr>
   </w:style>
   <w:style w:type="paragraph" w:customStyle="1" w:styleId="Body">
@@ -12374,7 +12374,7 @@
     <w:rPr>
       <w:rFonts w:ascii="Source Han Sans SC" w:hAnsi="Source Han Sans SC" w:eastAsia="思源黑体"/>
       <w:b w:val="0"/>
-      <w:sz w:val="17"/>
+      <w:sz w:val="16"/>
     </w:rPr>
   </w:style>
 </w:styles>

</xml_diff>

<commit_message>
refine: tighten beyond ridge feature spacing
</commit_message>
<xml_diff>
--- a/manuscripts/09_feature_越岭_几华里.docx
+++ b/manuscripts/09_feature_越岭_几华里.docx
@@ -20,7 +20,7 @@
     </w:p>
     <w:p>
       <w:pPr>
-        <w:pStyle w:val="Body"/>
+        <w:pStyle w:val="FeatureLead"/>
       </w:pPr>
       <w:r>
         <w:t>山东大学学生科幻协会成立以后，很早就开始尝试同其他高校的科幻社团建立联系。现存材料中，2007年的“驻济高校科幻联盟”筹备、2020年的“山与海”跨校联文以及2024年的月曜杯，构成了几段较为清晰的记录。它们彼此之间没有可以确认的组织继承关系，但都与同一个问题有关：山东省不同高校里的科幻爱好者，怎样彼此找到对方。</w:t>
@@ -12347,7 +12347,7 @@
     <w:rPr>
       <w:rFonts w:ascii="Source Han Serif SC" w:hAnsi="Source Han Serif SC" w:eastAsia="思源宋体"/>
       <w:b w:val="0"/>
-      <w:sz w:val="22"/>
+      <w:sz w:val="19"/>
     </w:rPr>
   </w:style>
   <w:style w:type="paragraph" w:customStyle="1" w:styleId="FeatureSection">

</xml_diff>

<commit_message>
fix: correct beyond ridge historical details
</commit_message>
<xml_diff>
--- a/manuscripts/09_feature_越岭_几华里.docx
+++ b/manuscripts/09_feature_越岭_几华里.docx
@@ -31,7 +31,7 @@
         <w:pStyle w:val="FeatureSection"/>
       </w:pPr>
       <w:r>
-        <w:t>2007 / 驻济高校科幻联盟的筹备</w:t>
+        <w:t>2007 / 早期“走出去”的尝试</w:t>
       </w:r>
     </w:p>
     <w:p>
@@ -39,7 +39,7 @@
         <w:pStyle w:val="Body"/>
       </w:pPr>
       <w:r>
-        <w:t>2007年，肖兆旭接任山东大学学生科幻协会会长。8月，他参加了在成都举行的中国国际科幻·奇幻大会。10月13日发布的《山东大学科幻协会07-08年度工作计划》中，已经提出新学年要加强协会“走出去”的力度，在山东省内与其他高校科幻类协会展开合作。</w:t>
+        <w:t>2007年，肖兆旭接任山东大学学生科幻协会会长。8月，副会长韩辞参加了在成都举行的中国国际科幻·奇幻大会。10月13日发布的《山东大学科幻协会07-08年度工作计划》中，已经提出新学年要加强协会“走出去”的力度，在山东省内与其他高校科幻类协会展开合作。</w:t>
       </w:r>
     </w:p>
     <w:p>
@@ -143,7 +143,7 @@
         <w:pStyle w:val="FeatureSection"/>
       </w:pPr>
       <w:r>
-        <w:t>2024 / 月曜杯</w:t>
+        <w:t>2024 / 第一届月曜杯</w:t>
       </w:r>
     </w:p>
     <w:p>
@@ -183,7 +183,7 @@
         <w:pStyle w:val="FeatureSection"/>
       </w:pPr>
       <w:r>
-        <w:t>2024.03.16 / 山东高校重新建群</w:t>
+        <w:t>2024.03.16 / 齐鲁科幻联盟的成立</w:t>
       </w:r>
     </w:p>
     <w:p>
@@ -207,7 +207,7 @@
         <w:pStyle w:val="Body"/>
       </w:pPr>
       <w:r>
-        <w:t>这句话颇能说明山东高校科幻社团长期面对的现实条件。2007年肖兆旭提到学校之间距离太远，2024年网络通讯已经十分方便，真正要在线下见面时，道路和校区分布依旧需要考虑。</w:t>
+        <w:t>这句话颇能说明山东高校科幻社团长期面对的现实条件。2007年肖兆旭提到学校之间距离太远。虽然2024年的交通已十分方便，但真正要在线下见面时，道路和校区分布依旧是需要考虑的事项。</w:t>
       </w:r>
     </w:p>
     <w:p>

</xml_diff>